<commit_message>
docs: version final PC-03 con Lighthouse real
</commit_message>
<xml_diff>
--- a/Claude outputs/PC03_Andina_SAC_Consolidado.docx
+++ b/Claude outputs/PC03_Andina_SAC_Consolidado.docx
@@ -956,7 +956,7 @@
           <w:sz w:val="21"/>
           <w:szCs w:val="21"/>
         </w:rPr>
-        <w:t xml:space="preserve">	29</w:t>
+        <w:t xml:space="preserve">	30</w:t>
       </w:r>
     </w:p>
     <w:p>
@@ -984,7 +984,7 @@
           <w:sz w:val="21"/>
           <w:szCs w:val="21"/>
         </w:rPr>
-        <w:t xml:space="preserve">	31</w:t>
+        <w:t xml:space="preserve">	32</w:t>
       </w:r>
     </w:p>
     <w:p>
@@ -1012,7 +1012,7 @@
           <w:sz w:val="21"/>
           <w:szCs w:val="21"/>
         </w:rPr>
-        <w:t xml:space="preserve">	33</w:t>
+        <w:t xml:space="preserve">	34</w:t>
       </w:r>
     </w:p>
     <w:p>
@@ -1040,7 +1040,7 @@
           <w:sz w:val="21"/>
           <w:szCs w:val="21"/>
         </w:rPr>
-        <w:t xml:space="preserve">	36</w:t>
+        <w:t xml:space="preserve">	37</w:t>
       </w:r>
     </w:p>
     <w:p>
@@ -13788,7 +13788,7 @@
                 <w:sz w:val="20"/>
                 <w:szCs w:val="20"/>
               </w:rPr>
-              <w:t xml:space="preserve">Es la herramienta más directa para un SPA como este; de hecho ya se extrajeron tiempos de carga reales sobre la build de producción (DOMContentLoaded 231 ms, TTFB 25 ms) usando las mismas APIs del navegador que usa Lighthouse internamente (sección 16).</w:t>
+              <w:t xml:space="preserve">Es la herramienta más directa para un SPA como este. El equipo ya la corrió sobre la build de producción: Performance 98/100, Accessibility 94/100, Best Practices 78/100, SEO 80/100, con LCP 0.8 s y CLS 0.066 (sección 16, Figura 12) — resultados oficiales, no estimados.</w:t>
             </w:r>
           </w:p>
         </w:tc>
@@ -15515,7 +15515,7 @@
                 <w:sz w:val="20"/>
                 <w:szCs w:val="20"/>
               </w:rPr>
-              <w:t xml:space="preserve">Puntaje de rendimiento estilo Lighthouse</w:t>
+              <w:t xml:space="preserve">Lighthouse — Performance (oficial, real)</w:t>
             </w:r>
           </w:p>
         </w:tc>
@@ -15575,7 +15575,7 @@
                 <w:sz w:val="20"/>
                 <w:szCs w:val="20"/>
               </w:rPr>
-              <w:t xml:space="preserve">Estimado 90-95/100 a partir de los datos reales de carga. Pendiente: el equipo debe correr el Lighthouse oficial desde DevTools → Lighthouse sobre localhost:4173 antes de la sustentación y reemplazar este estimado (ver nota).</w:t>
+              <w:t xml:space="preserve">98/100 — medido por el equipo con DevTools → Lighthouse sobre /dashboard autenticado, build de producción (localhost:4173)</w:t>
             </w:r>
           </w:p>
         </w:tc>
@@ -15605,7 +15605,7 @@
                 <w:sz w:val="20"/>
                 <w:szCs w:val="20"/>
               </w:rPr>
-              <w:t xml:space="preserve">⚠</w:t>
+              <w:t xml:space="preserve">✓</w:t>
             </w:r>
           </w:p>
         </w:tc>
@@ -15638,7 +15638,7 @@
                 <w:sz w:val="20"/>
                 <w:szCs w:val="20"/>
               </w:rPr>
-              <w:t xml:space="preserve">Core Web Vitals — LCP / CLS</w:t>
+              <w:t xml:space="preserve">Lighthouse — Accessibility (oficial, real)</w:t>
             </w:r>
           </w:p>
         </w:tc>
@@ -15669,7 +15669,7 @@
                 <w:sz w:val="20"/>
                 <w:szCs w:val="20"/>
               </w:rPr>
-              <w:t xml:space="preserve">LCP &lt; 2500 ms</w:t>
+              <w:t xml:space="preserve">≥ 80/100</w:t>
             </w:r>
           </w:p>
         </w:tc>
@@ -15700,7 +15700,7 @@
                 <w:sz w:val="20"/>
                 <w:szCs w:val="20"/>
               </w:rPr>
-              <w:t xml:space="preserve">No capturado en esta auditoría: la sesión remota usada para medir no registró entradas largest-contentful-paint. Pendiente de captura manual por el equipo (2 minutos, ver nota) — no se reporta como "cumple" sin el dato real.</w:t>
+              <w:t xml:space="preserve">94/100 — consistente con el escaneo propio del DOM de esta auditoría (0 elementos sin etiqueta)</w:t>
             </w:r>
           </w:p>
         </w:tc>
@@ -15731,7 +15731,7 @@
                 <w:sz w:val="20"/>
                 <w:szCs w:val="20"/>
               </w:rPr>
-              <w:t xml:space="preserve">⚠</w:t>
+              <w:t xml:space="preserve">✓</w:t>
             </w:r>
           </w:p>
         </w:tc>
@@ -15763,7 +15763,7 @@
                 <w:sz w:val="20"/>
                 <w:szCs w:val="20"/>
               </w:rPr>
-              <w:t xml:space="preserve">Accesibilidad — botones y campos etiquetados, módulo Unidades (real, build de producción)</w:t>
+              <w:t xml:space="preserve">Lighthouse — Best Practices (oficial, real)</w:t>
             </w:r>
           </w:p>
         </w:tc>
@@ -15793,7 +15793,7 @@
                 <w:sz w:val="20"/>
                 <w:szCs w:val="20"/>
               </w:rPr>
-              <w:t xml:space="preserve">100% etiquetados</w:t>
+              <w:t xml:space="preserve">≥ 80/100</w:t>
             </w:r>
           </w:p>
         </w:tc>
@@ -15823,7 +15823,7 @@
                 <w:sz w:val="20"/>
                 <w:szCs w:val="20"/>
               </w:rPr>
-              <w:t xml:space="preserve">21/21 botones con etiqueta accesible; 0 imágenes sin alt (no hay imágenes en esta vista)</w:t>
+              <w:t xml:space="preserve">78/100 — por debajo de la meta; es coherente con los hallazgos reales de esta PC-03 (incidencia #11: 6 vulnerabilidades de dependencias vía npm audit, 1 crítica)</w:t>
             </w:r>
           </w:p>
         </w:tc>
@@ -15853,7 +15853,7 @@
                 <w:sz w:val="20"/>
                 <w:szCs w:val="20"/>
               </w:rPr>
-              <w:t xml:space="preserve">✓</w:t>
+              <w:t xml:space="preserve">⚠</w:t>
             </w:r>
           </w:p>
         </w:tc>
@@ -15886,7 +15886,7 @@
                 <w:sz w:val="20"/>
                 <w:szCs w:val="20"/>
               </w:rPr>
-              <w:t xml:space="preserve">Accesibilidad — botones y campos etiquetados, pantalla de login (real, build de producción)</w:t>
+              <w:t xml:space="preserve">Lighthouse — SEO (oficial, real)</w:t>
             </w:r>
           </w:p>
         </w:tc>
@@ -15917,7 +15917,7 @@
                 <w:sz w:val="20"/>
                 <w:szCs w:val="20"/>
               </w:rPr>
-              <w:t xml:space="preserve">100% etiquetados</w:t>
+              <w:t xml:space="preserve">≥ 80/100</w:t>
             </w:r>
           </w:p>
         </w:tc>
@@ -15948,7 +15948,7 @@
                 <w:sz w:val="20"/>
                 <w:szCs w:val="20"/>
               </w:rPr>
-              <w:t xml:space="preserve">4/4 botones y 3/3 campos de formulario con etiqueta accesible</w:t>
+              <w:t xml:space="preserve">80/100 — justo en el límite; no se investigó la causa puntual (fuera del alcance de esta PC-03, es un panel interno, no indexable)</w:t>
             </w:r>
           </w:p>
         </w:tc>
@@ -16011,7 +16011,7 @@
                 <w:sz w:val="20"/>
                 <w:szCs w:val="20"/>
               </w:rPr>
-              <w:t xml:space="preserve">Accesibilidad — jerarquía de encabezados, módulo Unidades (real)</w:t>
+              <w:t xml:space="preserve">Largest Contentful Paint — LCP (oficial, real)</w:t>
             </w:r>
           </w:p>
         </w:tc>
@@ -16041,7 +16041,7 @@
                 <w:sz w:val="20"/>
                 <w:szCs w:val="20"/>
               </w:rPr>
-              <w:t xml:space="preserve">h1 único + h2/h3 por sección</w:t>
+              <w:t xml:space="preserve">&lt; 2500 ms</w:t>
             </w:r>
           </w:p>
         </w:tc>
@@ -16071,7 +16071,7 @@
                 <w:sz w:val="20"/>
                 <w:szCs w:val="20"/>
               </w:rPr>
-              <w:t xml:space="preserve">Solo hay un &lt;h1&gt; (el de la marca, en el layout compartido); la vista de Unidades no tiene un &lt;h2&gt; propio de página — el único &lt;h2&gt; del archivo fuente vive dentro del modal "Editar Unidad" y no aparece en el DOM mientras el modal está cerrado.</w:t>
+              <w:t xml:space="preserve">0.8 s (800 ms)</w:t>
             </w:r>
           </w:p>
         </w:tc>
@@ -16101,7 +16101,7 @@
                 <w:sz w:val="20"/>
                 <w:szCs w:val="20"/>
               </w:rPr>
-              <w:t xml:space="preserve">⚠</w:t>
+              <w:t xml:space="preserve">✓</w:t>
             </w:r>
           </w:p>
         </w:tc>
@@ -16134,7 +16134,7 @@
                 <w:sz w:val="20"/>
                 <w:szCs w:val="20"/>
               </w:rPr>
-              <w:t xml:space="preserve">Accesibilidad — jerarquía de encabezados, pantalla de login (real)</w:t>
+              <w:t xml:space="preserve">Cumulative Layout Shift — CLS (oficial, real)</w:t>
             </w:r>
           </w:p>
         </w:tc>
@@ -16165,7 +16165,7 @@
                 <w:sz w:val="20"/>
                 <w:szCs w:val="20"/>
               </w:rPr>
-              <w:t xml:space="preserve">Un solo h1 por página</w:t>
+              <w:t xml:space="preserve">&lt; 0.1</w:t>
             </w:r>
           </w:p>
         </w:tc>
@@ -16196,7 +16196,7 @@
                 <w:sz w:val="20"/>
                 <w:szCs w:val="20"/>
               </w:rPr>
-              <w:t xml:space="preserve">Hay DOS &lt;h1&gt; en el DOM (uno por cada panel responsive, móvil y escritorio, que coexisten) además de 3 &lt;h2&gt; — jerarquía rica pero con un &lt;h1&gt; duplicado, confirmado también por una revisión independiente del código fuente.</w:t>
+              <w:t xml:space="preserve">0.066</w:t>
             </w:r>
           </w:p>
         </w:tc>
@@ -16227,7 +16227,7 @@
                 <w:sz w:val="20"/>
                 <w:szCs w:val="20"/>
               </w:rPr>
-              <w:t xml:space="preserve">⚠</w:t>
+              <w:t xml:space="preserve">✓</w:t>
             </w:r>
           </w:p>
         </w:tc>
@@ -16259,7 +16259,7 @@
                 <w:sz w:val="20"/>
                 <w:szCs w:val="20"/>
               </w:rPr>
-              <w:t xml:space="preserve">Buenas prácticas — consola (real, build de producción)</w:t>
+              <w:t xml:space="preserve">Total Blocking Time — TBT (oficial, real)</w:t>
             </w:r>
           </w:p>
         </w:tc>
@@ -16289,7 +16289,7 @@
                 <w:sz w:val="20"/>
                 <w:szCs w:val="20"/>
               </w:rPr>
-              <w:t xml:space="preserve">0 errores</w:t>
+              <w:t xml:space="preserve">&lt; 200 ms</w:t>
             </w:r>
           </w:p>
         </w:tc>
@@ -16319,7 +16319,7 @@
                 <w:sz w:val="20"/>
                 <w:szCs w:val="20"/>
               </w:rPr>
-              <w:t xml:space="preserve">0 errores / 0 warnings</w:t>
+              <w:t xml:space="preserve">90 ms</w:t>
             </w:r>
           </w:p>
         </w:tc>
@@ -16382,7 +16382,7 @@
                 <w:sz w:val="20"/>
                 <w:szCs w:val="20"/>
               </w:rPr>
-              <w:t xml:space="preserve">Cobertura de código (pruebas unitarias/integración automatizadas)</w:t>
+              <w:t xml:space="preserve">Accesibilidad — botones y campos etiquetados, módulo Unidades (real, build de producción)</w:t>
             </w:r>
           </w:p>
         </w:tc>
@@ -16413,7 +16413,7 @@
                 <w:sz w:val="20"/>
                 <w:szCs w:val="20"/>
               </w:rPr>
-              <w:t xml:space="preserve">&gt; 0%</w:t>
+              <w:t xml:space="preserve">100% etiquetados</w:t>
             </w:r>
           </w:p>
         </w:tc>
@@ -16444,7 +16444,7 @@
                 <w:sz w:val="20"/>
                 <w:szCs w:val="20"/>
               </w:rPr>
-              <w:t xml:space="preserve">0% — no existe Vitest, Jest ni ningún framework de pruebas automatizadas en package.json; toda la cobertura actual es manual (sección 9)</w:t>
+              <w:t xml:space="preserve">21/21 botones con etiqueta accesible; 0 imágenes sin alt (no hay imágenes en esta vista)</w:t>
             </w:r>
           </w:p>
         </w:tc>
@@ -16475,7 +16475,7 @@
                 <w:sz w:val="20"/>
                 <w:szCs w:val="20"/>
               </w:rPr>
-              <w:t xml:space="preserve">⚠</w:t>
+              <w:t xml:space="preserve">✓</w:t>
             </w:r>
           </w:p>
         </w:tc>
@@ -16507,7 +16507,7 @@
                 <w:sz w:val="20"/>
                 <w:szCs w:val="20"/>
               </w:rPr>
-              <w:t xml:space="preserve">% de automatización del flujo de pruebas / CI</w:t>
+              <w:t xml:space="preserve">Accesibilidad — botones y campos etiquetados, pantalla de login (real, build de producción)</w:t>
             </w:r>
           </w:p>
         </w:tc>
@@ -16537,7 +16537,7 @@
                 <w:sz w:val="20"/>
                 <w:szCs w:val="20"/>
               </w:rPr>
-              <w:t xml:space="preserve">&gt; 0%</w:t>
+              <w:t xml:space="preserve">100% etiquetados</w:t>
             </w:r>
           </w:p>
         </w:tc>
@@ -16567,7 +16567,7 @@
                 <w:sz w:val="20"/>
                 <w:szCs w:val="20"/>
               </w:rPr>
-              <w:t xml:space="preserve">0% — no existe carpeta .github/workflows ni script de lint/test en package.json; el flujo de CI de la sección 14 es conceptual, no implementado</w:t>
+              <w:t xml:space="preserve">4/4 botones y 3/3 campos de formulario con etiqueta accesible</w:t>
             </w:r>
           </w:p>
         </w:tc>
@@ -16597,7 +16597,7 @@
                 <w:sz w:val="20"/>
                 <w:szCs w:val="20"/>
               </w:rPr>
-              <w:t xml:space="preserve">⚠</w:t>
+              <w:t xml:space="preserve">✓</w:t>
             </w:r>
           </w:p>
         </w:tc>
@@ -16630,7 +16630,7 @@
                 <w:sz w:val="20"/>
                 <w:szCs w:val="20"/>
               </w:rPr>
-              <w:t xml:space="preserve">Vulnerabilidades de dependencias (npm audit, real)</w:t>
+              <w:t xml:space="preserve">Accesibilidad — jerarquía de encabezados, módulo Unidades (real)</w:t>
             </w:r>
           </w:p>
         </w:tc>
@@ -16661,7 +16661,7 @@
                 <w:sz w:val="20"/>
                 <w:szCs w:val="20"/>
               </w:rPr>
-              <w:t xml:space="preserve">0 críticas/altas</w:t>
+              <w:t xml:space="preserve">h1 único + h2/h3 por sección</w:t>
             </w:r>
           </w:p>
         </w:tc>
@@ -16692,7 +16692,7 @@
                 <w:sz w:val="20"/>
                 <w:szCs w:val="20"/>
               </w:rPr>
-              <w:t xml:space="preserve">6 vulnerabilidades de producción: 1 crítica (maplibre-gl) y 5 altas (axios, xlsx y transitivas) — ver incidencia #11</w:t>
+              <w:t xml:space="preserve">Solo hay un &lt;h1&gt; (el de la marca, en el layout compartido); la vista de Unidades no tiene un &lt;h2&gt; propio de página — el único &lt;h2&gt; del archivo fuente vive dentro del modal "Editar Unidad" y no aparece en el DOM mientras el modal está cerrado.</w:t>
             </w:r>
           </w:p>
         </w:tc>
@@ -16755,6 +16755,625 @@
                 <w:sz w:val="20"/>
                 <w:szCs w:val="20"/>
               </w:rPr>
+              <w:t xml:space="preserve">Accesibilidad — jerarquía de encabezados, pantalla de login (real)</w:t>
+            </w:r>
+          </w:p>
+        </w:tc>
+        <w:tc>
+          <w:tcPr>
+            <w:tcW w:type="dxa" w:w="1600"/>
+            <w:tcMar>
+              <w:top w:type="dxa" w:w="80"/>
+              <w:left w:type="dxa" w:w="100"/>
+              <w:bottom w:type="dxa" w:w="80"/>
+              <w:right w:type="dxa" w:w="100"/>
+            </w:tcMar>
+            <w:vAlign w:val="center"/>
+          </w:tcPr>
+          <w:p>
+            <w:pPr>
+              <w:spacing w:line="276" w:lineRule="auto"/>
+              <w:jc w:val="left"/>
+            </w:pPr>
+            <w:r>
+              <w:rPr>
+                <w:rFonts w:ascii="Arial" w:cs="Arial" w:eastAsia="Arial" w:hAnsi="Arial"/>
+                <w:b w:val="false"/>
+                <w:bCs w:val="false"/>
+                <w:i w:val="false"/>
+                <w:iCs w:val="false"/>
+                <w:sz w:val="20"/>
+                <w:szCs w:val="20"/>
+              </w:rPr>
+              <w:t xml:space="preserve">Un solo h1 por página</w:t>
+            </w:r>
+          </w:p>
+        </w:tc>
+        <w:tc>
+          <w:tcPr>
+            <w:tcW w:type="dxa" w:w="3800"/>
+            <w:tcMar>
+              <w:top w:type="dxa" w:w="80"/>
+              <w:left w:type="dxa" w:w="100"/>
+              <w:bottom w:type="dxa" w:w="80"/>
+              <w:right w:type="dxa" w:w="100"/>
+            </w:tcMar>
+            <w:vAlign w:val="center"/>
+          </w:tcPr>
+          <w:p>
+            <w:pPr>
+              <w:spacing w:line="276" w:lineRule="auto"/>
+              <w:jc w:val="left"/>
+            </w:pPr>
+            <w:r>
+              <w:rPr>
+                <w:rFonts w:ascii="Arial" w:cs="Arial" w:eastAsia="Arial" w:hAnsi="Arial"/>
+                <w:b w:val="false"/>
+                <w:bCs w:val="false"/>
+                <w:i w:val="false"/>
+                <w:iCs w:val="false"/>
+                <w:sz w:val="20"/>
+                <w:szCs w:val="20"/>
+              </w:rPr>
+              <w:t xml:space="preserve">Hay DOS &lt;h1&gt; en el DOM (uno por cada panel responsive, móvil y escritorio, que coexisten) además de 3 &lt;h2&gt; — jerarquía rica pero con un &lt;h1&gt; duplicado, confirmado también por una revisión independiente del código fuente.</w:t>
+            </w:r>
+          </w:p>
+        </w:tc>
+        <w:tc>
+          <w:tcPr>
+            <w:tcW w:type="dxa" w:w="1472"/>
+            <w:tcMar>
+              <w:top w:type="dxa" w:w="80"/>
+              <w:left w:type="dxa" w:w="100"/>
+              <w:bottom w:type="dxa" w:w="80"/>
+              <w:right w:type="dxa" w:w="100"/>
+            </w:tcMar>
+            <w:vAlign w:val="center"/>
+          </w:tcPr>
+          <w:p>
+            <w:pPr>
+              <w:spacing w:line="276" w:lineRule="auto"/>
+              <w:jc w:val="left"/>
+            </w:pPr>
+            <w:r>
+              <w:rPr>
+                <w:rFonts w:ascii="Arial" w:cs="Arial" w:eastAsia="Arial" w:hAnsi="Arial"/>
+                <w:b w:val="false"/>
+                <w:bCs w:val="false"/>
+                <w:i w:val="false"/>
+                <w:iCs w:val="false"/>
+                <w:sz w:val="20"/>
+                <w:szCs w:val="20"/>
+              </w:rPr>
+              <w:t xml:space="preserve">⚠</w:t>
+            </w:r>
+          </w:p>
+        </w:tc>
+      </w:tr>
+      <w:tr>
+        <w:tc>
+          <w:tcPr>
+            <w:tcW w:type="dxa" w:w="2200"/>
+            <w:shd w:fill="F2F2F2" w:val="clear"/>
+            <w:tcMar>
+              <w:top w:type="dxa" w:w="80"/>
+              <w:left w:type="dxa" w:w="100"/>
+              <w:bottom w:type="dxa" w:w="80"/>
+              <w:right w:type="dxa" w:w="100"/>
+            </w:tcMar>
+            <w:vAlign w:val="center"/>
+          </w:tcPr>
+          <w:p>
+            <w:pPr>
+              <w:spacing w:line="276" w:lineRule="auto"/>
+              <w:jc w:val="left"/>
+            </w:pPr>
+            <w:r>
+              <w:rPr>
+                <w:rFonts w:ascii="Arial" w:cs="Arial" w:eastAsia="Arial" w:hAnsi="Arial"/>
+                <w:b w:val="false"/>
+                <w:bCs w:val="false"/>
+                <w:i w:val="false"/>
+                <w:iCs w:val="false"/>
+                <w:sz w:val="20"/>
+                <w:szCs w:val="20"/>
+              </w:rPr>
+              <w:t xml:space="preserve">Buenas prácticas — consola (real, build de producción)</w:t>
+            </w:r>
+          </w:p>
+        </w:tc>
+        <w:tc>
+          <w:tcPr>
+            <w:tcW w:type="dxa" w:w="1600"/>
+            <w:shd w:fill="F2F2F2" w:val="clear"/>
+            <w:tcMar>
+              <w:top w:type="dxa" w:w="80"/>
+              <w:left w:type="dxa" w:w="100"/>
+              <w:bottom w:type="dxa" w:w="80"/>
+              <w:right w:type="dxa" w:w="100"/>
+            </w:tcMar>
+            <w:vAlign w:val="center"/>
+          </w:tcPr>
+          <w:p>
+            <w:pPr>
+              <w:spacing w:line="276" w:lineRule="auto"/>
+              <w:jc w:val="left"/>
+            </w:pPr>
+            <w:r>
+              <w:rPr>
+                <w:rFonts w:ascii="Arial" w:cs="Arial" w:eastAsia="Arial" w:hAnsi="Arial"/>
+                <w:b w:val="false"/>
+                <w:bCs w:val="false"/>
+                <w:i w:val="false"/>
+                <w:iCs w:val="false"/>
+                <w:sz w:val="20"/>
+                <w:szCs w:val="20"/>
+              </w:rPr>
+              <w:t xml:space="preserve">0 errores</w:t>
+            </w:r>
+          </w:p>
+        </w:tc>
+        <w:tc>
+          <w:tcPr>
+            <w:tcW w:type="dxa" w:w="3800"/>
+            <w:shd w:fill="F2F2F2" w:val="clear"/>
+            <w:tcMar>
+              <w:top w:type="dxa" w:w="80"/>
+              <w:left w:type="dxa" w:w="100"/>
+              <w:bottom w:type="dxa" w:w="80"/>
+              <w:right w:type="dxa" w:w="100"/>
+            </w:tcMar>
+            <w:vAlign w:val="center"/>
+          </w:tcPr>
+          <w:p>
+            <w:pPr>
+              <w:spacing w:line="276" w:lineRule="auto"/>
+              <w:jc w:val="left"/>
+            </w:pPr>
+            <w:r>
+              <w:rPr>
+                <w:rFonts w:ascii="Arial" w:cs="Arial" w:eastAsia="Arial" w:hAnsi="Arial"/>
+                <w:b w:val="false"/>
+                <w:bCs w:val="false"/>
+                <w:i w:val="false"/>
+                <w:iCs w:val="false"/>
+                <w:sz w:val="20"/>
+                <w:szCs w:val="20"/>
+              </w:rPr>
+              <w:t xml:space="preserve">0 errores / 0 warnings</w:t>
+            </w:r>
+          </w:p>
+        </w:tc>
+        <w:tc>
+          <w:tcPr>
+            <w:tcW w:type="dxa" w:w="1472"/>
+            <w:shd w:fill="F2F2F2" w:val="clear"/>
+            <w:tcMar>
+              <w:top w:type="dxa" w:w="80"/>
+              <w:left w:type="dxa" w:w="100"/>
+              <w:bottom w:type="dxa" w:w="80"/>
+              <w:right w:type="dxa" w:w="100"/>
+            </w:tcMar>
+            <w:vAlign w:val="center"/>
+          </w:tcPr>
+          <w:p>
+            <w:pPr>
+              <w:spacing w:line="276" w:lineRule="auto"/>
+              <w:jc w:val="left"/>
+            </w:pPr>
+            <w:r>
+              <w:rPr>
+                <w:rFonts w:ascii="Arial" w:cs="Arial" w:eastAsia="Arial" w:hAnsi="Arial"/>
+                <w:b w:val="false"/>
+                <w:bCs w:val="false"/>
+                <w:i w:val="false"/>
+                <w:iCs w:val="false"/>
+                <w:sz w:val="20"/>
+                <w:szCs w:val="20"/>
+              </w:rPr>
+              <w:t xml:space="preserve">✓</w:t>
+            </w:r>
+          </w:p>
+        </w:tc>
+      </w:tr>
+      <w:tr>
+        <w:tc>
+          <w:tcPr>
+            <w:tcW w:type="dxa" w:w="2200"/>
+            <w:tcMar>
+              <w:top w:type="dxa" w:w="80"/>
+              <w:left w:type="dxa" w:w="100"/>
+              <w:bottom w:type="dxa" w:w="80"/>
+              <w:right w:type="dxa" w:w="100"/>
+            </w:tcMar>
+            <w:vAlign w:val="center"/>
+          </w:tcPr>
+          <w:p>
+            <w:pPr>
+              <w:spacing w:line="276" w:lineRule="auto"/>
+              <w:jc w:val="left"/>
+            </w:pPr>
+            <w:r>
+              <w:rPr>
+                <w:rFonts w:ascii="Arial" w:cs="Arial" w:eastAsia="Arial" w:hAnsi="Arial"/>
+                <w:b w:val="false"/>
+                <w:bCs w:val="false"/>
+                <w:i w:val="false"/>
+                <w:iCs w:val="false"/>
+                <w:sz w:val="20"/>
+                <w:szCs w:val="20"/>
+              </w:rPr>
+              <w:t xml:space="preserve">Cobertura de código (pruebas unitarias/integración automatizadas)</w:t>
+            </w:r>
+          </w:p>
+        </w:tc>
+        <w:tc>
+          <w:tcPr>
+            <w:tcW w:type="dxa" w:w="1600"/>
+            <w:tcMar>
+              <w:top w:type="dxa" w:w="80"/>
+              <w:left w:type="dxa" w:w="100"/>
+              <w:bottom w:type="dxa" w:w="80"/>
+              <w:right w:type="dxa" w:w="100"/>
+            </w:tcMar>
+            <w:vAlign w:val="center"/>
+          </w:tcPr>
+          <w:p>
+            <w:pPr>
+              <w:spacing w:line="276" w:lineRule="auto"/>
+              <w:jc w:val="left"/>
+            </w:pPr>
+            <w:r>
+              <w:rPr>
+                <w:rFonts w:ascii="Arial" w:cs="Arial" w:eastAsia="Arial" w:hAnsi="Arial"/>
+                <w:b w:val="false"/>
+                <w:bCs w:val="false"/>
+                <w:i w:val="false"/>
+                <w:iCs w:val="false"/>
+                <w:sz w:val="20"/>
+                <w:szCs w:val="20"/>
+              </w:rPr>
+              <w:t xml:space="preserve">&gt; 0%</w:t>
+            </w:r>
+          </w:p>
+        </w:tc>
+        <w:tc>
+          <w:tcPr>
+            <w:tcW w:type="dxa" w:w="3800"/>
+            <w:tcMar>
+              <w:top w:type="dxa" w:w="80"/>
+              <w:left w:type="dxa" w:w="100"/>
+              <w:bottom w:type="dxa" w:w="80"/>
+              <w:right w:type="dxa" w:w="100"/>
+            </w:tcMar>
+            <w:vAlign w:val="center"/>
+          </w:tcPr>
+          <w:p>
+            <w:pPr>
+              <w:spacing w:line="276" w:lineRule="auto"/>
+              <w:jc w:val="left"/>
+            </w:pPr>
+            <w:r>
+              <w:rPr>
+                <w:rFonts w:ascii="Arial" w:cs="Arial" w:eastAsia="Arial" w:hAnsi="Arial"/>
+                <w:b w:val="false"/>
+                <w:bCs w:val="false"/>
+                <w:i w:val="false"/>
+                <w:iCs w:val="false"/>
+                <w:sz w:val="20"/>
+                <w:szCs w:val="20"/>
+              </w:rPr>
+              <w:t xml:space="preserve">0% — no existe Vitest, Jest ni ningún framework de pruebas automatizadas en package.json; toda la cobertura actual es manual (sección 9)</w:t>
+            </w:r>
+          </w:p>
+        </w:tc>
+        <w:tc>
+          <w:tcPr>
+            <w:tcW w:type="dxa" w:w="1472"/>
+            <w:tcMar>
+              <w:top w:type="dxa" w:w="80"/>
+              <w:left w:type="dxa" w:w="100"/>
+              <w:bottom w:type="dxa" w:w="80"/>
+              <w:right w:type="dxa" w:w="100"/>
+            </w:tcMar>
+            <w:vAlign w:val="center"/>
+          </w:tcPr>
+          <w:p>
+            <w:pPr>
+              <w:spacing w:line="276" w:lineRule="auto"/>
+              <w:jc w:val="left"/>
+            </w:pPr>
+            <w:r>
+              <w:rPr>
+                <w:rFonts w:ascii="Arial" w:cs="Arial" w:eastAsia="Arial" w:hAnsi="Arial"/>
+                <w:b w:val="false"/>
+                <w:bCs w:val="false"/>
+                <w:i w:val="false"/>
+                <w:iCs w:val="false"/>
+                <w:sz w:val="20"/>
+                <w:szCs w:val="20"/>
+              </w:rPr>
+              <w:t xml:space="preserve">⚠</w:t>
+            </w:r>
+          </w:p>
+        </w:tc>
+      </w:tr>
+      <w:tr>
+        <w:tc>
+          <w:tcPr>
+            <w:tcW w:type="dxa" w:w="2200"/>
+            <w:shd w:fill="F2F2F2" w:val="clear"/>
+            <w:tcMar>
+              <w:top w:type="dxa" w:w="80"/>
+              <w:left w:type="dxa" w:w="100"/>
+              <w:bottom w:type="dxa" w:w="80"/>
+              <w:right w:type="dxa" w:w="100"/>
+            </w:tcMar>
+            <w:vAlign w:val="center"/>
+          </w:tcPr>
+          <w:p>
+            <w:pPr>
+              <w:spacing w:line="276" w:lineRule="auto"/>
+              <w:jc w:val="left"/>
+            </w:pPr>
+            <w:r>
+              <w:rPr>
+                <w:rFonts w:ascii="Arial" w:cs="Arial" w:eastAsia="Arial" w:hAnsi="Arial"/>
+                <w:b w:val="false"/>
+                <w:bCs w:val="false"/>
+                <w:i w:val="false"/>
+                <w:iCs w:val="false"/>
+                <w:sz w:val="20"/>
+                <w:szCs w:val="20"/>
+              </w:rPr>
+              <w:t xml:space="preserve">% de automatización del flujo de pruebas / CI</w:t>
+            </w:r>
+          </w:p>
+        </w:tc>
+        <w:tc>
+          <w:tcPr>
+            <w:tcW w:type="dxa" w:w="1600"/>
+            <w:shd w:fill="F2F2F2" w:val="clear"/>
+            <w:tcMar>
+              <w:top w:type="dxa" w:w="80"/>
+              <w:left w:type="dxa" w:w="100"/>
+              <w:bottom w:type="dxa" w:w="80"/>
+              <w:right w:type="dxa" w:w="100"/>
+            </w:tcMar>
+            <w:vAlign w:val="center"/>
+          </w:tcPr>
+          <w:p>
+            <w:pPr>
+              <w:spacing w:line="276" w:lineRule="auto"/>
+              <w:jc w:val="left"/>
+            </w:pPr>
+            <w:r>
+              <w:rPr>
+                <w:rFonts w:ascii="Arial" w:cs="Arial" w:eastAsia="Arial" w:hAnsi="Arial"/>
+                <w:b w:val="false"/>
+                <w:bCs w:val="false"/>
+                <w:i w:val="false"/>
+                <w:iCs w:val="false"/>
+                <w:sz w:val="20"/>
+                <w:szCs w:val="20"/>
+              </w:rPr>
+              <w:t xml:space="preserve">&gt; 0%</w:t>
+            </w:r>
+          </w:p>
+        </w:tc>
+        <w:tc>
+          <w:tcPr>
+            <w:tcW w:type="dxa" w:w="3800"/>
+            <w:shd w:fill="F2F2F2" w:val="clear"/>
+            <w:tcMar>
+              <w:top w:type="dxa" w:w="80"/>
+              <w:left w:type="dxa" w:w="100"/>
+              <w:bottom w:type="dxa" w:w="80"/>
+              <w:right w:type="dxa" w:w="100"/>
+            </w:tcMar>
+            <w:vAlign w:val="center"/>
+          </w:tcPr>
+          <w:p>
+            <w:pPr>
+              <w:spacing w:line="276" w:lineRule="auto"/>
+              <w:jc w:val="left"/>
+            </w:pPr>
+            <w:r>
+              <w:rPr>
+                <w:rFonts w:ascii="Arial" w:cs="Arial" w:eastAsia="Arial" w:hAnsi="Arial"/>
+                <w:b w:val="false"/>
+                <w:bCs w:val="false"/>
+                <w:i w:val="false"/>
+                <w:iCs w:val="false"/>
+                <w:sz w:val="20"/>
+                <w:szCs w:val="20"/>
+              </w:rPr>
+              <w:t xml:space="preserve">0% — no existe carpeta .github/workflows ni script de lint/test en package.json; el flujo de CI de la sección 14 es conceptual, no implementado</w:t>
+            </w:r>
+          </w:p>
+        </w:tc>
+        <w:tc>
+          <w:tcPr>
+            <w:tcW w:type="dxa" w:w="1472"/>
+            <w:shd w:fill="F2F2F2" w:val="clear"/>
+            <w:tcMar>
+              <w:top w:type="dxa" w:w="80"/>
+              <w:left w:type="dxa" w:w="100"/>
+              <w:bottom w:type="dxa" w:w="80"/>
+              <w:right w:type="dxa" w:w="100"/>
+            </w:tcMar>
+            <w:vAlign w:val="center"/>
+          </w:tcPr>
+          <w:p>
+            <w:pPr>
+              <w:spacing w:line="276" w:lineRule="auto"/>
+              <w:jc w:val="left"/>
+            </w:pPr>
+            <w:r>
+              <w:rPr>
+                <w:rFonts w:ascii="Arial" w:cs="Arial" w:eastAsia="Arial" w:hAnsi="Arial"/>
+                <w:b w:val="false"/>
+                <w:bCs w:val="false"/>
+                <w:i w:val="false"/>
+                <w:iCs w:val="false"/>
+                <w:sz w:val="20"/>
+                <w:szCs w:val="20"/>
+              </w:rPr>
+              <w:t xml:space="preserve">⚠</w:t>
+            </w:r>
+          </w:p>
+        </w:tc>
+      </w:tr>
+      <w:tr>
+        <w:tc>
+          <w:tcPr>
+            <w:tcW w:type="dxa" w:w="2200"/>
+            <w:tcMar>
+              <w:top w:type="dxa" w:w="80"/>
+              <w:left w:type="dxa" w:w="100"/>
+              <w:bottom w:type="dxa" w:w="80"/>
+              <w:right w:type="dxa" w:w="100"/>
+            </w:tcMar>
+            <w:vAlign w:val="center"/>
+          </w:tcPr>
+          <w:p>
+            <w:pPr>
+              <w:spacing w:line="276" w:lineRule="auto"/>
+              <w:jc w:val="left"/>
+            </w:pPr>
+            <w:r>
+              <w:rPr>
+                <w:rFonts w:ascii="Arial" w:cs="Arial" w:eastAsia="Arial" w:hAnsi="Arial"/>
+                <w:b w:val="false"/>
+                <w:bCs w:val="false"/>
+                <w:i w:val="false"/>
+                <w:iCs w:val="false"/>
+                <w:sz w:val="20"/>
+                <w:szCs w:val="20"/>
+              </w:rPr>
+              <w:t xml:space="preserve">Vulnerabilidades de dependencias (npm audit, real)</w:t>
+            </w:r>
+          </w:p>
+        </w:tc>
+        <w:tc>
+          <w:tcPr>
+            <w:tcW w:type="dxa" w:w="1600"/>
+            <w:tcMar>
+              <w:top w:type="dxa" w:w="80"/>
+              <w:left w:type="dxa" w:w="100"/>
+              <w:bottom w:type="dxa" w:w="80"/>
+              <w:right w:type="dxa" w:w="100"/>
+            </w:tcMar>
+            <w:vAlign w:val="center"/>
+          </w:tcPr>
+          <w:p>
+            <w:pPr>
+              <w:spacing w:line="276" w:lineRule="auto"/>
+              <w:jc w:val="left"/>
+            </w:pPr>
+            <w:r>
+              <w:rPr>
+                <w:rFonts w:ascii="Arial" w:cs="Arial" w:eastAsia="Arial" w:hAnsi="Arial"/>
+                <w:b w:val="false"/>
+                <w:bCs w:val="false"/>
+                <w:i w:val="false"/>
+                <w:iCs w:val="false"/>
+                <w:sz w:val="20"/>
+                <w:szCs w:val="20"/>
+              </w:rPr>
+              <w:t xml:space="preserve">0 críticas/altas</w:t>
+            </w:r>
+          </w:p>
+        </w:tc>
+        <w:tc>
+          <w:tcPr>
+            <w:tcW w:type="dxa" w:w="3800"/>
+            <w:tcMar>
+              <w:top w:type="dxa" w:w="80"/>
+              <w:left w:type="dxa" w:w="100"/>
+              <w:bottom w:type="dxa" w:w="80"/>
+              <w:right w:type="dxa" w:w="100"/>
+            </w:tcMar>
+            <w:vAlign w:val="center"/>
+          </w:tcPr>
+          <w:p>
+            <w:pPr>
+              <w:spacing w:line="276" w:lineRule="auto"/>
+              <w:jc w:val="left"/>
+            </w:pPr>
+            <w:r>
+              <w:rPr>
+                <w:rFonts w:ascii="Arial" w:cs="Arial" w:eastAsia="Arial" w:hAnsi="Arial"/>
+                <w:b w:val="false"/>
+                <w:bCs w:val="false"/>
+                <w:i w:val="false"/>
+                <w:iCs w:val="false"/>
+                <w:sz w:val="20"/>
+                <w:szCs w:val="20"/>
+              </w:rPr>
+              <w:t xml:space="preserve">6 vulnerabilidades de producción: 1 crítica (maplibre-gl) y 5 altas (axios, xlsx y transitivas) — ver incidencia #11</w:t>
+            </w:r>
+          </w:p>
+        </w:tc>
+        <w:tc>
+          <w:tcPr>
+            <w:tcW w:type="dxa" w:w="1472"/>
+            <w:tcMar>
+              <w:top w:type="dxa" w:w="80"/>
+              <w:left w:type="dxa" w:w="100"/>
+              <w:bottom w:type="dxa" w:w="80"/>
+              <w:right w:type="dxa" w:w="100"/>
+            </w:tcMar>
+            <w:vAlign w:val="center"/>
+          </w:tcPr>
+          <w:p>
+            <w:pPr>
+              <w:spacing w:line="276" w:lineRule="auto"/>
+              <w:jc w:val="left"/>
+            </w:pPr>
+            <w:r>
+              <w:rPr>
+                <w:rFonts w:ascii="Arial" w:cs="Arial" w:eastAsia="Arial" w:hAnsi="Arial"/>
+                <w:b w:val="false"/>
+                <w:bCs w:val="false"/>
+                <w:i w:val="false"/>
+                <w:iCs w:val="false"/>
+                <w:sz w:val="20"/>
+                <w:szCs w:val="20"/>
+              </w:rPr>
+              <w:t xml:space="preserve">⚠</w:t>
+            </w:r>
+          </w:p>
+        </w:tc>
+      </w:tr>
+      <w:tr>
+        <w:tc>
+          <w:tcPr>
+            <w:tcW w:type="dxa" w:w="2200"/>
+            <w:shd w:fill="F2F2F2" w:val="clear"/>
+            <w:tcMar>
+              <w:top w:type="dxa" w:w="80"/>
+              <w:left w:type="dxa" w:w="100"/>
+              <w:bottom w:type="dxa" w:w="80"/>
+              <w:right w:type="dxa" w:w="100"/>
+            </w:tcMar>
+            <w:vAlign w:val="center"/>
+          </w:tcPr>
+          <w:p>
+            <w:pPr>
+              <w:spacing w:line="276" w:lineRule="auto"/>
+              <w:jc w:val="left"/>
+            </w:pPr>
+            <w:r>
+              <w:rPr>
+                <w:rFonts w:ascii="Arial" w:cs="Arial" w:eastAsia="Arial" w:hAnsi="Arial"/>
+                <w:b w:val="false"/>
+                <w:bCs w:val="false"/>
+                <w:i w:val="false"/>
+                <w:iCs w:val="false"/>
+                <w:sz w:val="20"/>
+                <w:szCs w:val="20"/>
+              </w:rPr>
               <w:t xml:space="preserve">Mantenibilidad / duplicidad de código (real, por inspección)</w:t>
             </w:r>
           </w:p>
@@ -16762,6 +17381,7 @@
         <w:tc>
           <w:tcPr>
             <w:tcW w:type="dxa" w:w="1600"/>
+            <w:shd w:fill="F2F2F2" w:val="clear"/>
             <w:tcMar>
               <w:top w:type="dxa" w:w="80"/>
               <w:left w:type="dxa" w:w="100"/>
@@ -16792,6 +17412,7 @@
         <w:tc>
           <w:tcPr>
             <w:tcW w:type="dxa" w:w="3800"/>
+            <w:shd w:fill="F2F2F2" w:val="clear"/>
             <w:tcMar>
               <w:top w:type="dxa" w:w="80"/>
               <w:left w:type="dxa" w:w="100"/>
@@ -16822,6 +17443,7 @@
         <w:tc>
           <w:tcPr>
             <w:tcW w:type="dxa" w:w="1472"/>
+            <w:shd w:fill="F2F2F2" w:val="clear"/>
             <w:tcMar>
               <w:top w:type="dxa" w:w="80"/>
               <w:left w:type="dxa" w:w="100"/>
@@ -16866,7 +17488,7 @@
           <w:sz w:val="19"/>
           <w:szCs w:val="19"/>
         </w:rPr>
-        <w:t xml:space="preserve">Nota sobre el puntaje de Lighthouse y Core Web Vitals: esta auditoría se ejecutó mediante la Performance API y un escaneo del DOM desde la consola de Chrome, lo cual da datos reales de tiempos de carga, peso transferido y etiquetado accesible, pero no genera el puntaje 0-100 oficial de Lighthouse ni capturó LCP/CLS. Ejecutar DevTools → Lighthouse directamente sobre http://localhost:4173 toma aproximadamente 2 minutos y reemplazaría estas dos filas con datos oficiales — el equipo debe hacerlo antes de la sustentación y no presentar el estimado 90-95/100 como un resultado de Lighthouse real. Se recomienda además pasar la extensión WAVE sobre el login y sobre Consumo y adjuntar la captura, como verificación independiente del escaneo de accesibilidad de esta tabla.</w:t>
+        <w:t xml:space="preserve">Nota sobre el puntaje de Lighthouse y Core Web Vitals: las filas de Performance API (más arriba en esta tabla) se midieron desde la consola de Chrome sobre una carga en frío de la pantalla de login. El puntaje oficial de Lighthouse y los Core Web Vitals (LCP, CLS, TBT) se midieron por separado con DevTools → Lighthouse, sobre la vista /dashboard ya autenticada como Administrador, también contra la build de producción (localhost:4173) — captura real en la Figura 12. Ambas mediciones son reales y coherentes entre sí: ninguna contradice a la otra, solo evalúan pantallas distintas de la misma aplicación. El resultado más bajo (Best Practices, 78/100) no se investigó a fondo dentro del alcance de esta PC-03, pero es consistente con la incidencia #11 (6 vulnerabilidades reales de dependencias) ya documentada en la sección 11 — Lighthouse penaliza el uso de librerías JavaScript con vulnerabilidades conocidas, que es exactamente lo que npm audit confirmó. Se recomienda además pasar la extensión WAVE sobre el login y sobre Consumo y adjuntar la captura, como verificación independiente adicional del escaneo de accesibilidad de esta tabla.</w:t>
       </w:r>
     </w:p>
     <w:p>
@@ -17102,6 +17724,69 @@
           <w:szCs w:val="18"/>
         </w:rPr>
         <w:t xml:space="preserve">Figura 11. Evidencia verificable: JSON real devuelto por la auditoría (Performance API + escaneo del DOM) en servidor de desarrollo y en build de producción, reproducible abriendo la consola de Chrome DevTools en la app y ejecutando el mismo script.</w:t>
+      </w:r>
+    </w:p>
+    <w:p>
+      <w:pPr>
+        <w:spacing w:after="120"/>
+        <w:jc w:val="center"/>
+      </w:pPr>
+      <w:r>
+        <w:drawing>
+          <wp:inline distT="0" distB="0" distL="0" distR="0">
+            <wp:extent cx="4000500" cy="2876550"/>
+            <wp:effectExtent t="0" r="0" b="0" l="0"/>
+            <wp:docPr id="1" name="" descr="" title=""/>
+            <wp:cNvGraphicFramePr>
+              <a:graphicFrameLocks xmlns:a="http://schemas.openxmlformats.org/drawingml/2006/main" noChangeAspect="1"/>
+            </wp:cNvGraphicFramePr>
+            <a:graphic xmlns:a="http://schemas.openxmlformats.org/drawingml/2006/main">
+              <a:graphicData uri="http://schemas.openxmlformats.org/drawingml/2006/picture">
+                <pic:pic xmlns:pic="http://schemas.openxmlformats.org/drawingml/2006/picture">
+                  <pic:nvPicPr>
+                    <pic:cNvPr id="0" name="" descr=""/>
+                    <pic:cNvPicPr>
+                      <a:picLocks noChangeAspect="1" noChangeArrowheads="1"/>
+                    </pic:cNvPicPr>
+                  </pic:nvPicPr>
+                  <pic:blipFill>
+                    <a:blip r:embed="rId19" cstate="none"/>
+                    <a:srcRect/>
+                    <a:stretch>
+                      <a:fillRect/>
+                    </a:stretch>
+                  </pic:blipFill>
+                  <pic:spPr bwMode="auto">
+                    <a:xfrm>
+                      <a:off x="0" y="0"/>
+                      <a:ext cx="4000500" cy="2876550"/>
+                    </a:xfrm>
+                    <a:prstGeom prst="rect">
+                      <a:avLst/>
+                    </a:prstGeom>
+                  </pic:spPr>
+                </pic:pic>
+              </a:graphicData>
+            </a:graphic>
+          </wp:inline>
+        </w:drawing>
+      </w:r>
+    </w:p>
+    <w:p>
+      <w:pPr>
+        <w:spacing w:after="240" w:before="80"/>
+        <w:jc w:val="center"/>
+      </w:pPr>
+      <w:r>
+        <w:rPr>
+          <w:rFonts w:ascii="Arial" w:cs="Arial" w:eastAsia="Arial" w:hAnsi="Arial"/>
+          <w:i/>
+          <w:iCs/>
+          <w:color w:val="555555"/>
+          <w:sz w:val="18"/>
+          <w:szCs w:val="18"/>
+        </w:rPr>
+        <w:t xml:space="preserve">Figura 12. Reporte oficial de Lighthouse (DevTools), capturado por el equipo sobre /dashboard autenticado, build de producción (localhost:4173): Performance 98, Accessibility 94, Best Practices 78, SEO 80 — con LCP 0.8 s, CLS 0.066 y Total Blocking Time 90 ms.</w:t>
       </w:r>
     </w:p>
     <w:p>

</xml_diff>